<commit_message>
Arquivo de modelagem atualizado com processo da lanchonete
</commit_message>
<xml_diff>
--- a/documentation/Modelagem.docx
+++ b/documentation/Modelagem.docx
@@ -8,7 +8,13 @@
         <w:pStyle w:val="Ttulo1"/>
       </w:pPr>
       <w:r>
-        <w:t>Processo da Cafeteria:</w:t>
+        <w:t>Processo d</w:t>
+      </w:r>
+      <w:r>
+        <w:t>a lanchone</w:t>
+      </w:r>
+      <w:r>
+        <w:t>te</w:t>
       </w:r>
     </w:p>
     <w:p>
@@ -28,7 +34,7 @@
         </w:numPr>
       </w:pPr>
       <w:r>
-        <w:t>Abastecer doces e salgados no balcão</w:t>
+        <w:t>Organizar Banners e itens na cabine</w:t>
       </w:r>
     </w:p>
     <w:p>
@@ -40,7 +46,10 @@
         </w:numPr>
       </w:pPr>
       <w:r>
-        <w:t>Ligar máquina de café expresso</w:t>
+        <w:t>Ligar</w:t>
+      </w:r>
+      <w:r>
+        <w:t xml:space="preserve"> a chapa de preparo de lanches</w:t>
       </w:r>
     </w:p>
     <w:p>
@@ -52,7 +61,7 @@
         </w:numPr>
       </w:pPr>
       <w:r>
-        <w:t>Fazer pedido para fornecedores seguindo a lista de compra.</w:t>
+        <w:t>Organizar ingredientes para preparo dos lanches</w:t>
       </w:r>
     </w:p>
     <w:p>
@@ -93,17 +102,20 @@
         <w:pStyle w:val="Ttulo2"/>
       </w:pPr>
       <w:r>
-        <w:t>Cozinha</w:t>
-      </w:r>
-    </w:p>
-    <w:p>
-      <w:r>
-        <w:t>Preparar salgados fritos na hora;</w:t>
-      </w:r>
-    </w:p>
-    <w:p>
-      <w:r>
-        <w:t>Preparar Lanches/Sucos</w:t>
+        <w:t>Preparar Lanches</w:t>
+      </w:r>
+    </w:p>
+    <w:p>
+      <w:r>
+        <w:t>Montar lanches</w:t>
+      </w:r>
+    </w:p>
+    <w:p>
+      <w:r>
+        <w:t>Prep</w:t>
+      </w:r>
+      <w:r>
+        <w:t xml:space="preserve">arar hamburgers e salsicha na </w:t>
       </w:r>
     </w:p>
     <w:p>
@@ -126,11 +138,6 @@
     </w:p>
     <w:p>
       <w:r>
-        <w:t>Abastecer doces salgados consumidos nos pedidos;</w:t>
-      </w:r>
-    </w:p>
-    <w:p>
-      <w:r>
         <w:t>Abastecer bebidas consumidas do refrigerador</w:t>
       </w:r>
     </w:p>
@@ -149,12 +156,7 @@
     </w:p>
     <w:p>
       <w:r>
-        <w:t>Empacotar salgados assados dentro da validade e colocar no freezer</w:t>
-      </w:r>
-    </w:p>
-    <w:p>
-      <w:r>
-        <w:t>Verificar doces e salgados fora da validade para descarte</w:t>
+        <w:t>Guardar ingredientes que precisam se manter refrigerados</w:t>
       </w:r>
     </w:p>
     <w:p>
@@ -184,21 +186,21 @@
     </w:p>
     <w:p>
       <w:r>
+        <w:t xml:space="preserve">Inserir balanço na planilha de </w:t>
+      </w:r>
+      <w:r>
+        <w:t>controle</w:t>
+      </w:r>
+      <w:r>
+        <w:t>.</w:t>
+      </w:r>
+    </w:p>
+    <w:p>
+      <w:pPr>
+        <w:pStyle w:val="Ttulo1"/>
+      </w:pPr>
+      <w:r>
         <w:lastRenderedPageBreak/>
-        <w:t xml:space="preserve">Inserir balanço na planilha de </w:t>
-      </w:r>
-      <w:r>
-        <w:t>controle</w:t>
-      </w:r>
-      <w:r>
-        <w:t>.</w:t>
-      </w:r>
-    </w:p>
-    <w:p>
-      <w:pPr>
-        <w:pStyle w:val="Ttulo1"/>
-      </w:pPr>
-      <w:r>
         <w:t>Desafios para gestão de fluxo de mercadorias</w:t>
       </w:r>
     </w:p>
@@ -241,22 +243,16 @@
         </w:numPr>
       </w:pPr>
       <w:r>
-        <w:t>Controle de itens fracionados em lanches com mais de um ingrediente;</w:t>
-      </w:r>
-    </w:p>
-    <w:p>
-      <w:pPr>
-        <w:pStyle w:val="Ttulo1"/>
-      </w:pPr>
-      <w:r>
-        <w:t>Regras de negócio (RN):</w:t>
-      </w:r>
-    </w:p>
-    <w:p>
-      <w:r>
-        <w:tab/>
-        <w:t>RN01 -</w:t>
-      </w:r>
+        <w:t xml:space="preserve">Controle de itens fracionados em lanches com mais de </w:t>
+      </w:r>
+      <w:proofErr w:type="gramStart"/>
+      <w:r>
+        <w:t>um ingrediente</w:t>
+      </w:r>
+      <w:r>
+        <w:t>s</w:t>
+      </w:r>
+      <w:proofErr w:type="gramEnd"/>
     </w:p>
     <w:p>
       <w:pPr>
@@ -1064,7 +1060,11 @@
         <w:t>remoção</w:t>
       </w:r>
       <w:r>
-        <w:t xml:space="preserve"> de</w:t>
+        <w:t xml:space="preserve"> </w:t>
+      </w:r>
+      <w:r>
+        <w:lastRenderedPageBreak/>
+        <w:t>de</w:t>
       </w:r>
       <w:r>
         <w:t xml:space="preserve"> </w:t>
@@ -1529,7 +1529,6 @@
         <w:t>Requisitos Funcionais</w:t>
       </w:r>
     </w:p>
-    <w:p/>
     <w:p>
       <w:r>
         <w:t>RF01 - O sistema deve possuir um login diferenciado para funcionário e gestor;</w:t>
@@ -1570,7 +1569,6 @@
     </w:p>
     <w:p>
       <w:r>
-        <w:lastRenderedPageBreak/>
         <w:t>RF05 - O sistema deve permitir a gestão de itens do estoque. Cadastrar, atualizar, excluir e gerar um indicador de quantidade atual;</w:t>
       </w:r>
     </w:p>
@@ -1698,332 +1696,6 @@
       </w:r>
     </w:p>
     <w:p/>
-    <w:p>
-      <w:pPr>
-        <w:pStyle w:val="Ttulo1"/>
-      </w:pPr>
-      <w:r>
-        <w:t>Fluxo Principal</w:t>
-      </w:r>
-    </w:p>
-    <w:p>
-      <w:pPr>
-        <w:pStyle w:val="Ttulo2"/>
-      </w:pPr>
-      <w:r>
-        <w:t>Inclusão de novo usuário:</w:t>
-      </w:r>
-    </w:p>
-    <w:p>
-      <w:r>
-        <w:tab/>
-        <w:t>1- Usuário informa matrícula</w:t>
-      </w:r>
-    </w:p>
-    <w:p>
-      <w:r>
-        <w:tab/>
-        <w:t>2- Sistema verifica se matrícula contém 6 dígitos</w:t>
-      </w:r>
-    </w:p>
-    <w:p>
-      <w:r>
-        <w:tab/>
-        <w:t>3- Se matrícula não tem 6 dígitos, chamar FA 01</w:t>
-      </w:r>
-    </w:p>
-    <w:p>
-      <w:r>
-        <w:tab/>
-        <w:t>4- Verificar se matrícula é existente na tabela USUÁRIO</w:t>
-      </w:r>
-    </w:p>
-    <w:p>
-      <w:r>
-        <w:lastRenderedPageBreak/>
-        <w:tab/>
-        <w:t xml:space="preserve">5- Se matrícula existente, enviar msg "Usuário já cadastrado", </w:t>
-      </w:r>
-      <w:proofErr w:type="gramStart"/>
-      <w:r>
-        <w:t>Encerrar</w:t>
-      </w:r>
-      <w:proofErr w:type="gramEnd"/>
-      <w:r>
-        <w:t xml:space="preserve"> caso de uso.</w:t>
-      </w:r>
-    </w:p>
-    <w:p>
-      <w:r>
-        <w:tab/>
-        <w:t>6- Usuário informar senha</w:t>
-      </w:r>
-    </w:p>
-    <w:p>
-      <w:r>
-        <w:tab/>
-        <w:t>7- Sistema verifica RN01</w:t>
-      </w:r>
-    </w:p>
-    <w:p>
-      <w:r>
-        <w:tab/>
-        <w:t>8- Se senha não Ok, chamar FA02</w:t>
-      </w:r>
-    </w:p>
-    <w:p>
-      <w:r>
-        <w:tab/>
-        <w:t>9- Usuário informa e-mail</w:t>
-      </w:r>
-    </w:p>
-    <w:p>
-      <w:r>
-        <w:tab/>
-        <w:t>10- Se e-mail possui @, chamar MSG01</w:t>
-      </w:r>
-    </w:p>
-    <w:p>
-      <w:r>
-        <w:tab/>
-        <w:t>11- Usuário informa número de celular</w:t>
-      </w:r>
-    </w:p>
-    <w:p>
-      <w:r>
-        <w:tab/>
-        <w:t>12- Se número de celular não tem 8 dígitos e não tem código de área, chamar MSG02</w:t>
-      </w:r>
-    </w:p>
-    <w:p>
-      <w:r>
-        <w:tab/>
-        <w:t>13- Gravar "ATIVO" no campo status</w:t>
-      </w:r>
-    </w:p>
-    <w:p>
-      <w:r>
-        <w:tab/>
-        <w:t>14- Salvar novo usuário</w:t>
-      </w:r>
-    </w:p>
-    <w:p>
-      <w:r>
-        <w:tab/>
-      </w:r>
-    </w:p>
-    <w:p>
-      <w:pPr>
-        <w:pStyle w:val="Ttulo2"/>
-      </w:pPr>
-      <w:r>
-        <w:t>Consultar usuário</w:t>
-      </w:r>
-    </w:p>
-    <w:p>
-      <w:r>
-        <w:tab/>
-        <w:t>1- Apresentar tela com dados do usuário, filtrado na tabela de USUÁRIO através da matrícula.</w:t>
-      </w:r>
-    </w:p>
-    <w:p>
-      <w:r>
-        <w:tab/>
-        <w:t xml:space="preserve">2- Verificar se status do usuário </w:t>
-      </w:r>
-      <w:proofErr w:type="spellStart"/>
-      <w:r>
-        <w:t>esta</w:t>
-      </w:r>
-      <w:proofErr w:type="spellEnd"/>
-      <w:r>
-        <w:t xml:space="preserve"> = a "ATIVO"</w:t>
-      </w:r>
-    </w:p>
-    <w:p>
-      <w:r>
-        <w:tab/>
-        <w:t>3- Se sim, mostrar msg "Usuário Inativo)</w:t>
-      </w:r>
-    </w:p>
-    <w:p>
-      <w:r>
-        <w:tab/>
-      </w:r>
-    </w:p>
-    <w:p>
-      <w:pPr>
-        <w:pStyle w:val="Ttulo2"/>
-      </w:pPr>
-      <w:r>
-        <w:t>Alterar dados do usuário</w:t>
-      </w:r>
-    </w:p>
-    <w:p>
-      <w:r>
-        <w:tab/>
-        <w:t>1- Alterar senha</w:t>
-      </w:r>
-    </w:p>
-    <w:p>
-      <w:r>
-        <w:tab/>
-        <w:t>2- Sistema verifica RN01</w:t>
-      </w:r>
-    </w:p>
-    <w:p>
-      <w:r>
-        <w:tab/>
-        <w:t>3- Se senha não OK, chamar FA02</w:t>
-      </w:r>
-    </w:p>
-    <w:p>
-      <w:r>
-        <w:tab/>
-        <w:t>4- Usuário altera e-mail</w:t>
-      </w:r>
-    </w:p>
-    <w:p>
-      <w:r>
-        <w:tab/>
-        <w:t>10- Se e-mail possui @, chamar MSG01</w:t>
-      </w:r>
-    </w:p>
-    <w:p>
-      <w:r>
-        <w:tab/>
-        <w:t>11- Usuário altera número de celular</w:t>
-      </w:r>
-    </w:p>
-    <w:p>
-      <w:r>
-        <w:tab/>
-        <w:t>12- Se número de celular não tem 8 dígitos e não tem código de área, chamar MSG02</w:t>
-      </w:r>
-    </w:p>
-    <w:p>
-      <w:r>
-        <w:tab/>
-        <w:t>13- Salvar novo usuário</w:t>
-      </w:r>
-    </w:p>
-    <w:p>
-      <w:r>
-        <w:tab/>
-      </w:r>
-    </w:p>
-    <w:p>
-      <w:pPr>
-        <w:pStyle w:val="Ttulo2"/>
-      </w:pPr>
-      <w:r>
-        <w:lastRenderedPageBreak/>
-        <w:t>Excluir usuário</w:t>
-      </w:r>
-    </w:p>
-    <w:p>
-      <w:r>
-        <w:tab/>
-        <w:t>1- Enviar msg "Deseja realmente excluir o usuário?"</w:t>
-      </w:r>
-    </w:p>
-    <w:p>
-      <w:r>
-        <w:tab/>
-        <w:t>2- Se S, gravar status do usuário como 'INATIVO"</w:t>
-      </w:r>
-    </w:p>
-    <w:p>
-      <w:r>
-        <w:tab/>
-        <w:t>3- Salvar exclusão de usuário</w:t>
-      </w:r>
-    </w:p>
-    <w:p>
-      <w:r>
-        <w:tab/>
-      </w:r>
-    </w:p>
-    <w:p>
-      <w:r>
-        <w:tab/>
-      </w:r>
-    </w:p>
-    <w:p>
-      <w:pPr>
-        <w:pStyle w:val="Ttulo2"/>
-      </w:pPr>
-      <w:r>
-        <w:t xml:space="preserve">Fluxo </w:t>
-      </w:r>
-      <w:r>
-        <w:t>Alternativo</w:t>
-      </w:r>
-      <w:r>
-        <w:t xml:space="preserve"> (FA)</w:t>
-      </w:r>
-    </w:p>
-    <w:p>
-      <w:r>
-        <w:tab/>
-        <w:t>FA01 - Enviar msg de "matrícula inválida"</w:t>
-      </w:r>
-    </w:p>
-    <w:p>
-      <w:r>
-        <w:tab/>
-      </w:r>
-      <w:r>
-        <w:tab/>
-        <w:t>Voltar para UC02</w:t>
-      </w:r>
-    </w:p>
-    <w:p>
-      <w:r>
-        <w:tab/>
-        <w:t xml:space="preserve">FA02 - Enviar msg "Senha inválida. Defina uma senha que contenha: no mínimo 8 dígitos, sendo pelo menos 1 letra maiúscula, 1 </w:t>
-      </w:r>
-      <w:r>
-        <w:t>caractere</w:t>
-      </w:r>
-      <w:r>
-        <w:t xml:space="preserve"> especial e 1 número."</w:t>
-      </w:r>
-    </w:p>
-    <w:p>
-      <w:r>
-        <w:tab/>
-      </w:r>
-      <w:r>
-        <w:tab/>
-        <w:t>Voltar para UC02</w:t>
-      </w:r>
-    </w:p>
-    <w:p>
-      <w:r>
-        <w:tab/>
-      </w:r>
-    </w:p>
-    <w:p>
-      <w:pPr>
-        <w:pStyle w:val="Ttulo2"/>
-      </w:pPr>
-      <w:r>
-        <w:t>Mensagens:</w:t>
-      </w:r>
-    </w:p>
-    <w:p>
-      <w:r>
-        <w:tab/>
-        <w:t>MSG01 - E-mail inválido</w:t>
-      </w:r>
-    </w:p>
-    <w:p>
-      <w:r>
-        <w:tab/>
-        <w:t>MSG02 - Número de celular inválido</w:t>
-      </w:r>
-    </w:p>
     <w:p>
       <w:pPr>
         <w:pStyle w:val="Ttulo1"/>

</xml_diff>